<commit_message>
fix: sync top-level manuscript with edited copy and record Zenodo DOI
- The Data-availability/List-of-abbreviations/AI-declaration edits
  made earlier had only been applied to
  submission_package_Ann-Epi/Manuscript_AnnEpi.docx, not to the
  top-level 04_Manuscripts/11_v11_...Annals.docx (the file referenced
  as "submitted manuscript" in README/REPRODUCE and the v1.0.0
  release notes). Overwrite the top-level file with the corrected
  copy so both are identical again.
- Record the Zenodo DOI issued for GitHub release v1.0.0
  (10.5281/zenodo.21127212) in the manuscript's Data availability
  statement, CITATION.cff, README.md, and the submission guide docs,
  replacing all remaining placeholders.

Co-Authored-By: Claude Sonnet 5 <noreply@anthropic.com>
</commit_message>
<xml_diff>
--- a/04_Manuscripts/11_v11_Administrative_Diabetes_Indicators_Care_Cascade_Annals.docx
+++ b/04_Manuscripts/11_v11_Administrative_Diabetes_Indicators_Care_Cascade_Annals.docx
@@ -1835,16 +1835,12 @@
     </w:p>
     <w:p>
       <w:r>
-        <w:t xml:space="preserve">The datasets supporting this study are openly released by the Ministry of Health, </w:t>
+        <w:t>The datasets supporting this study are openly released by the Ministry of Health, Labour and Welfare of Japan as part of the NDB Open Data and contain no individual-level records (https://www.mhlw.go.jp/stf/seisakunitsuite/bunya/0000177182.html). Aggregate area-level data and analysis code used to produce the reported results are available at https://github.com/haruki00430/administrative-diabetes-indicators-japan and archived on Zenodo (https://doi.org/10.5281/zenodo.21127212).</w:t>
       </w:r>
       <w:proofErr w:type="spellStart"/>
-      <w:r>
-        <w:t>Labour</w:t>
-      </w:r>
+      <w:r/>
       <w:proofErr w:type="spellEnd"/>
-      <w:r>
-        <w:t xml:space="preserve"> and Welfare of Japan as part of the NDB Open Data and contain no individual-level records (https://www.mhlw.go.jp/stf/seisakunitsuite/bunya/0000177182.html).</w:t>
-      </w:r>
+      <w:r/>
     </w:p>
     <w:p>
       <w:pPr>
@@ -1918,17 +1914,28 @@
         <w:pStyle w:val="21"/>
       </w:pPr>
       <w:r>
-        <w:t>Use of generative artificial intelligence</w:t>
+        <w:t>List of abbreviations</w:t>
       </w:r>
     </w:p>
     <w:p>
-      <w:r>
-        <w:t xml:space="preserve">During preparation of this work, the authors used generative AI tools to assist with data-processing code and language editing. The authors reviewed and verified all analyses, figures, references, and final text, </w:t>
-      </w:r>
-      <w:r>
-        <w:lastRenderedPageBreak/>
-        <w:t>and take full responsibility for the content. Generative AI was not listed as an author. This disclosure should be adapted to the specific policy of the journal at submission.</w:t>
-      </w:r>
+      <w:pPr/>
+      <w:r>
+        <w:t>NDB, National Database of Health Insurance Claims and Specific Health Checkups of Japan; FY, fiscal year; HbA1c, glycated hemoglobin A1c; FPG, fasting plasma glucose; PCA, principal component analysis; PC, principal component; MAUP, modifiable areal unit problem; B001-20, medical fee code for diabetes complication management guidance; B001-27, medical fee code for diabetes dialysis prevention guidance management.</w:t>
+      </w:r>
+    </w:p>
+    <w:p>
+      <w:pPr>
+        <w:pStyle w:val="21"/>
+      </w:pPr>
+      <w:r>
+        <w:t>Declaration of generative AI and AI-assisted technologies in the manuscript preparation process</w:t>
+      </w:r>
+    </w:p>
+    <w:p>
+      <w:r>
+        <w:t>During the preparation of this work, the authors used Claude Sonnet 4.6 (Claude Code, Anthropic) and OpenAI Codex to assist with development and verification of data-processing and statistical analysis code, and to support language editing of the manuscript text. After using these tools, the authors reviewed and edited all content as needed, verified the accuracy and originality of the analyses and interpretations, and take full responsibility for the content of the published article.</w:t>
+      </w:r>
+      <w:r/>
     </w:p>
     <w:p>
       <w:pPr>

</xml_diff>